<commit_message>
feat: align group workbench and worksheet downloads with pros and cons review
</commit_message>
<xml_diff>
--- a/materials/group-11-12.docx
+++ b/materials/group-11-12.docx
@@ -176,7 +176,9 @@
               <w:spacing w:after="0" w:line="276" w:lineRule="auto"/>
               <w:jc w:val="center"/>
             </w:pPr>
-            <w:r/>
+            <w:r>
+              <w:t>장단점</w:t>
+            </w:r>
             <w:r>
               <w:rPr>
                 <w:rFonts w:ascii="Arial Unicode MS" w:hAnsi="Arial Unicode MS" w:eastAsia="Arial Unicode MS"/>
@@ -184,7 +186,6 @@
                 <w:color w:val="000000"/>
                 <w:sz w:val="20"/>
               </w:rPr>
-              <w:t>중요한 이유</w:t>
             </w:r>
           </w:p>
         </w:tc>
@@ -493,7 +494,7 @@
           <w:color w:val="000000"/>
           <w:sz w:val="25"/>
         </w:rPr>
-        <w:t>02   의견 모으기</w:t>
+        <w:t>02   의견 모으기 · 장단점 검토하기</w:t>
       </w:r>
     </w:p>
     <w:tbl>
@@ -616,7 +617,8 @@
         </w:tblCellMar>
       </w:tblPr>
       <w:tblGrid>
-        <w:gridCol w:w="10091"/>
+        <w:gridCol w:w="5045"/>
+        <w:gridCol w:w="5045"/>
       </w:tblGrid>
       <w:tr>
         <w:trPr>
@@ -625,14 +627,16 @@
         </w:trPr>
         <w:tc>
           <w:tcPr>
-            <w:tcW w:type="dxa" w:w="10092"/>
+            <w:tcW w:type="dxa" w:w="5045"/>
             <w:vAlign w:val="top"/>
           </w:tcPr>
           <w:p>
             <w:pPr>
               <w:spacing w:after="0" w:line="276" w:lineRule="auto"/>
             </w:pPr>
-            <w:r/>
+            <w:r>
+              <w:t>장점: 좋은 점과 그 이유</w:t>
+            </w:r>
             <w:r>
               <w:rPr>
                 <w:rFonts w:ascii="Arial Unicode MS" w:hAnsi="Arial Unicode MS" w:eastAsia="Arial Unicode MS"/>
@@ -640,7 +644,28 @@
                 <w:color w:val="000000"/>
                 <w:sz w:val="21"/>
               </w:rPr>
-              <w:t>의견을 비교하며 나온 좋은 점과 걱정되는 점</w:t>
+            </w:r>
+          </w:p>
+        </w:tc>
+        <w:tc>
+          <w:tcPr>
+            <w:tcW w:type="dxa" w:w="5045"/>
+            <w:vAlign w:val="top"/>
+          </w:tcPr>
+          <w:p>
+            <w:pPr>
+              <w:spacing w:after="0" w:line="276" w:lineRule="auto"/>
+            </w:pPr>
+            <w:r>
+              <w:t>단점: 걱정되는 점과 그 이유</w:t>
+            </w:r>
+            <w:r>
+              <w:rPr>
+                <w:rFonts w:ascii="Arial Unicode MS" w:hAnsi="Arial Unicode MS" w:eastAsia="Arial Unicode MS"/>
+                <w:b/>
+                <w:color w:val="000000"/>
+                <w:sz w:val="21"/>
+              </w:rPr>
             </w:r>
           </w:p>
         </w:tc>
@@ -700,7 +725,7 @@
       </w:tblGrid>
       <w:tr>
         <w:trPr>
-          <w:trHeight w:val="1020" w:hRule="atLeast"/>
+          <w:trHeight w:val="2020" w:hRule="atLeast"/>
           <w:cantSplit/>
         </w:trPr>
         <w:tc>
@@ -712,7 +737,9 @@
             <w:pPr>
               <w:spacing w:after="0" w:line="276" w:lineRule="auto"/>
             </w:pPr>
-            <w:r/>
+            <w:r>
+              <w:t>우리 모둠의 최종 의견과 근거</w:t>
+            </w:r>
             <w:r>
               <w:rPr>
                 <w:rFonts w:ascii="Arial Unicode MS" w:hAnsi="Arial Unicode MS" w:eastAsia="Arial Unicode MS"/>
@@ -720,72 +747,6 @@
                 <w:color w:val="000000"/>
                 <w:sz w:val="21"/>
               </w:rPr>
-              <w:t>우리 모둠의 최종 제안과 선택한 이유</w:t>
-            </w:r>
-          </w:p>
-        </w:tc>
-      </w:tr>
-    </w:tbl>
-    <w:p>
-      <w:pPr>
-        <w:spacing w:before="0" w:after="20" w:line="40" w:lineRule="exact"/>
-      </w:pPr>
-      <w:r>
-        <w:rPr>
-          <w:rFonts w:ascii="Arial Unicode MS" w:hAnsi="Arial Unicode MS" w:eastAsia="Arial Unicode MS"/>
-          <w:b w:val="0"/>
-          <w:color w:val="000000"/>
-          <w:sz w:val="2"/>
-        </w:rPr>
-      </w:r>
-    </w:p>
-    <w:tbl>
-      <w:tblPr>
-        <w:tblW w:type="auto" w:w="0"/>
-        <w:jc w:val="center"/>
-        <w:tblLayout w:type="fixed"/>
-        <w:tblLook w:firstColumn="1" w:firstRow="1" w:lastColumn="0" w:lastRow="0" w:noHBand="0" w:noVBand="1" w:val="04A0"/>
-        <w:tblBorders>
-          <w:top w:val="single" w:sz="5" w:color="BDC6CD"/>
-          <w:left w:val="single" w:sz="5" w:color="BDC6CD"/>
-          <w:bottom w:val="single" w:sz="5" w:color="BDC6CD"/>
-          <w:right w:val="single" w:sz="5" w:color="BDC6CD"/>
-          <w:insideH w:val="single" w:sz="5" w:color="BDC6CD"/>
-          <w:insideV w:val="single" w:sz="5" w:color="BDC6CD"/>
-        </w:tblBorders>
-        <w:tblCellMar>
-          <w:top w:w="110" w:type="dxa"/>
-          <w:left w:w="110" w:type="dxa"/>
-          <w:bottom w:w="110" w:type="dxa"/>
-          <w:right w:w="110" w:type="dxa"/>
-        </w:tblCellMar>
-      </w:tblPr>
-      <w:tblGrid>
-        <w:gridCol w:w="10091"/>
-      </w:tblGrid>
-      <w:tr>
-        <w:trPr>
-          <w:trHeight w:val="794" w:hRule="atLeast"/>
-          <w:cantSplit/>
-        </w:trPr>
-        <w:tc>
-          <w:tcPr>
-            <w:tcW w:type="dxa" w:w="10092"/>
-            <w:vAlign w:val="top"/>
-          </w:tcPr>
-          <w:p>
-            <w:pPr>
-              <w:spacing w:after="0" w:line="276" w:lineRule="auto"/>
-            </w:pPr>
-            <w:r/>
-            <w:r>
-              <w:rPr>
-                <w:rFonts w:ascii="Arial Unicode MS" w:hAnsi="Arial Unicode MS" w:eastAsia="Arial Unicode MS"/>
-                <w:b/>
-                <w:color w:val="000000"/>
-                <w:sz w:val="21"/>
-              </w:rPr>
-              <w:t>친구 의견을 반영해 고치거나 더한 점</w:t>
             </w:r>
           </w:p>
         </w:tc>

</xml_diff>

<commit_message>
feat: add discussion agreements and blank memo to duplex group worksheet
</commit_message>
<xml_diff>
--- a/materials/group-11-12.docx
+++ b/materials/group-11-12.docx
@@ -779,6 +779,147 @@
         <w:t>남은 걱정이나 더 확인할 점: ___________________________________________</w:t>
       </w:r>
     </w:p>
+    <w:p>
+      <w:r>
+        <w:br w:type="page"/>
+      </w:r>
+    </w:p>
+    <w:p>
+      <w:pPr>
+        <w:spacing w:before="0" w:after="160" w:line="276" w:lineRule="auto"/>
+      </w:pPr>
+      <w:r>
+        <w:rPr>
+          <w:rFonts w:ascii="맑은 고딕" w:hAnsi="맑은 고딕" w:eastAsia="맑은 고딕"/>
+          <w:b/>
+          <w:sz w:val="18"/>
+        </w:rPr>
+        <w:t>우리 지역 보행 안전 토의   /   11~12차시</w:t>
+      </w:r>
+    </w:p>
+    <w:p>
+      <w:pPr>
+        <w:spacing w:before="0" w:after="320" w:line="276" w:lineRule="auto"/>
+      </w:pPr>
+      <w:r>
+        <w:rPr>
+          <w:rFonts w:ascii="맑은 고딕" w:hAnsi="맑은 고딕" w:eastAsia="맑은 고딕"/>
+          <w:b/>
+          <w:sz w:val="44"/>
+        </w:rPr>
+        <w:t>우리 모둠의 토의 약속</w:t>
+      </w:r>
+    </w:p>
+    <w:p>
+      <w:pPr>
+        <w:spacing w:before="0" w:after="200" w:line="276" w:lineRule="auto"/>
+      </w:pPr>
+      <w:r>
+        <w:rPr>
+          <w:rFonts w:ascii="맑은 고딕" w:hAnsi="맑은 고딕" w:eastAsia="맑은 고딕"/>
+          <w:b w:val="0"/>
+          <w:sz w:val="26"/>
+        </w:rPr>
+        <w:t>• 발언권 얻고 말하기</w:t>
+      </w:r>
+    </w:p>
+    <w:p>
+      <w:pPr>
+        <w:spacing w:before="0" w:after="200" w:line="276" w:lineRule="auto"/>
+      </w:pPr>
+      <w:r>
+        <w:rPr>
+          <w:rFonts w:ascii="맑은 고딕" w:hAnsi="맑은 고딕" w:eastAsia="맑은 고딕"/>
+          <w:b w:val="0"/>
+          <w:sz w:val="26"/>
+        </w:rPr>
+        <w:t>• 의견을 끝까지 듣기</w:t>
+      </w:r>
+    </w:p>
+    <w:p>
+      <w:pPr>
+        <w:spacing w:before="0" w:after="200" w:line="276" w:lineRule="auto"/>
+      </w:pPr>
+      <w:r>
+        <w:rPr>
+          <w:rFonts w:ascii="맑은 고딕" w:hAnsi="맑은 고딕" w:eastAsia="맑은 고딕"/>
+          <w:b w:val="0"/>
+          <w:sz w:val="26"/>
+        </w:rPr>
+        <w:t>• 이유와 근거를 들어 말하기</w:t>
+      </w:r>
+    </w:p>
+    <w:p>
+      <w:pPr>
+        <w:spacing w:before="0" w:after="200" w:line="276" w:lineRule="auto"/>
+      </w:pPr>
+      <w:r>
+        <w:rPr>
+          <w:rFonts w:ascii="맑은 고딕" w:hAnsi="맑은 고딕" w:eastAsia="맑은 고딕"/>
+          <w:b w:val="0"/>
+          <w:sz w:val="26"/>
+        </w:rPr>
+        <w:t>• 서로 다른 의견을 존중하기</w:t>
+      </w:r>
+    </w:p>
+    <w:p>
+      <w:pPr>
+        <w:spacing w:before="0" w:after="200" w:line="276" w:lineRule="auto"/>
+      </w:pPr>
+      <w:r>
+        <w:rPr>
+          <w:rFonts w:ascii="맑은 고딕" w:hAnsi="맑은 고딕" w:eastAsia="맑은 고딕"/>
+          <w:b w:val="0"/>
+          <w:sz w:val="26"/>
+        </w:rPr>
+        <w:t>• 충분히 협의하여 결정하기</w:t>
+      </w:r>
+    </w:p>
+    <w:p>
+      <w:pPr>
+        <w:spacing w:before="0" w:after="140" w:line="276" w:lineRule="auto"/>
+      </w:pPr>
+      <w:r>
+        <w:rPr>
+          <w:rFonts w:ascii="맑은 고딕" w:hAnsi="맑은 고딕" w:eastAsia="맑은 고딕"/>
+          <w:b/>
+          <w:sz w:val="25"/>
+        </w:rPr>
+        <w:t>자유 메모</w:t>
+      </w:r>
+    </w:p>
+    <w:tbl>
+      <w:tblPr>
+        <w:tblW w:type="auto" w:w="0"/>
+        <w:tblLayout w:type="fixed"/>
+        <w:tblLook w:firstColumn="1" w:firstRow="1" w:lastColumn="0" w:lastRow="0" w:noHBand="0" w:noVBand="1" w:val="04A0"/>
+      </w:tblPr>
+      <w:tblGrid>
+        <w:gridCol w:w="10091"/>
+      </w:tblGrid>
+      <w:tr>
+        <w:trPr>
+          <w:trHeight w:val="8500" w:hRule="exact"/>
+        </w:trPr>
+        <w:tc>
+          <w:tcPr>
+            <w:tcW w:type="dxa" w:w="10091"/>
+            <w:tcBorders>
+              <w:top w:val="single" w:sz="5" w:color="BDC6CD"/>
+              <w:left w:val="single" w:sz="5" w:color="BDC6CD"/>
+              <w:bottom w:val="single" w:sz="5" w:color="BDC6CD"/>
+              <w:right w:val="single" w:sz="5" w:color="BDC6CD"/>
+            </w:tcBorders>
+          </w:tcPr>
+          <w:p/>
+        </w:tc>
+      </w:tr>
+    </w:tbl>
+    <w:p>
+      <w:pPr>
+        <w:spacing w:after="0"/>
+      </w:pPr>
+    </w:p>
     <w:sectPr>
       <w:footerReference w:type="default" r:id="rId9"/>
       <w:pgSz w:w="11906" w:h="16838"/>

</xml_diff>

<commit_message>
fix: remove shared focus line from group worksheet
</commit_message>
<xml_diff>
--- a/materials/group-11-12.docx
+++ b/materials/group-11-12.docx
@@ -192,7 +192,7 @@
       </w:tr>
       <w:tr>
         <w:trPr>
-          <w:trHeight w:val="510" w:hRule="atLeast"/>
+          <w:trHeight w:val="595" w:hRule="atLeast"/>
           <w:cantSplit/>
         </w:trPr>
         <w:tc>
@@ -258,7 +258,7 @@
       </w:tr>
       <w:tr>
         <w:trPr>
-          <w:trHeight w:val="510" w:hRule="atLeast"/>
+          <w:trHeight w:val="595" w:hRule="atLeast"/>
           <w:cantSplit/>
         </w:trPr>
         <w:tc>
@@ -324,7 +324,7 @@
       </w:tr>
       <w:tr>
         <w:trPr>
-          <w:trHeight w:val="510" w:hRule="atLeast"/>
+          <w:trHeight w:val="595" w:hRule="atLeast"/>
           <w:cantSplit/>
         </w:trPr>
         <w:tc>
@@ -390,7 +390,7 @@
       </w:tr>
       <w:tr>
         <w:trPr>
-          <w:trHeight w:val="510" w:hRule="atLeast"/>
+          <w:trHeight w:val="595" w:hRule="atLeast"/>
           <w:cantSplit/>
         </w:trPr>
         <w:tc>
@@ -466,20 +466,6 @@
           <w:color w:val="000000"/>
           <w:sz w:val="2"/>
         </w:rPr>
-      </w:r>
-    </w:p>
-    <w:p>
-      <w:pPr>
-        <w:spacing w:before="60" w:after="80" w:line="283" w:lineRule="auto"/>
-      </w:pPr>
-      <w:r>
-        <w:rPr>
-          <w:rFonts w:ascii="Arial Unicode MS" w:hAnsi="Arial Unicode MS" w:eastAsia="Arial Unicode MS"/>
-          <w:b w:val="0"/>
-          <w:color w:val="000000"/>
-          <w:sz w:val="22"/>
-        </w:rPr>
-        <w:t>함께 집중할 문제: ___________________________________________________</w:t>
       </w:r>
     </w:p>
     <w:p>

</xml_diff>

<commit_message>
feat: put group Padlets first and add website QR to worksheets
</commit_message>
<xml_diff>
--- a/materials/group-11-12.docx
+++ b/materials/group-11-12.docx
@@ -14,6 +14,48 @@
           <w:sz w:val="18"/>
         </w:rPr>
         <w:t>우리 지역 보행 안전 토의   /   11~12차시</w:t>
+      </w:r>
+      <w:r>
+        <w:drawing>
+          <wp:anchor distT="0" distB="0" distL="0" distR="0" simplePos="0" relativeHeight="251659264" behindDoc="0" locked="0" layoutInCell="1" allowOverlap="0">
+            <wp:simplePos x="0" y="0"/>
+            <wp:positionH relativeFrom="page">
+              <wp:posOffset>5943600</wp:posOffset>
+            </wp:positionH>
+            <wp:positionV relativeFrom="page">
+              <wp:posOffset>482600</wp:posOffset>
+            </wp:positionV>
+            <wp:extent cx="1041400" cy="1041400"/>
+            <wp:wrapNone/>
+            <wp:docPr id="1" name="Picture 1" descr="우리 웹사이트 QR https://luckybridge.github.io/interview/"/>
+            <wp:cNvGraphicFramePr xmlns:a="http://schemas.openxmlformats.org/drawingml/2006/main">
+              <a:graphicFrameLocks noChangeAspect="1"/>
+            </wp:cNvGraphicFramePr>
+            <a:graphic xmlns:a="http://schemas.openxmlformats.org/drawingml/2006/main" xmlns:pic="http://schemas.openxmlformats.org/drawingml/2006/picture">
+              <a:graphicData uri="http://schemas.openxmlformats.org/drawingml/2006/picture">
+                <pic:pic>
+                  <pic:nvPicPr>
+                    <pic:cNvPr id="0" name="site-qr.png"/>
+                    <pic:cNvPicPr/>
+                  </pic:nvPicPr>
+                  <pic:blipFill>
+                    <a:blip r:embed="rId10"/>
+                    <a:stretch>
+                      <a:fillRect/>
+                    </a:stretch>
+                  </pic:blipFill>
+                  <pic:spPr>
+                    <a:xfrm>
+                      <a:off x="0" y="0"/>
+                      <a:ext cx="1041400" cy="1041400"/>
+                    </a:xfrm>
+                    <a:prstGeom prst="rect"/>
+                  </pic:spPr>
+                </pic:pic>
+              </a:graphicData>
+            </a:graphic>
+          </wp:anchor>
+        </w:drawing>
       </w:r>
     </w:p>
     <w:p>

</xml_diff>